<commit_message>
Speed up Google Sheets sync and document it in the technical guide/report
Cache the resolved gspread Worksheet handle (not just the client) so a
repeat sync skips ~1.6s of redundant open_by_key()/worksheet() network
calls; run the three startup maintenance tasks as immediate background
scheduler jobs instead of blocking server startup before the first
request is accepted. Profiled before/after: repeat sync 1.1s -> 0.4s,
worksheet lookup 1.6s -> 0s cached.

Document the whole Sheets sync feature (design, the cursor.rowcount bug,
the no-auto-delete decision, and this perf fix) in Guide_Technique and
Rapport_Professionnel, regenerated from generate_docs.py.

Co-Authored-By: Claude Sonnet 5 <noreply@anthropic.com>
</commit_message>
<xml_diff>
--- a/Documentation/reports/Guide_Technique_DevoTeam_Dashboard.docx
+++ b/Documentation/reports/Guide_Technique_DevoTeam_Dashboard.docx
@@ -231,6 +231,17 @@
           <w:color w:val="242422"/>
         </w:rPr>
         <w:t>Alertes deadlines (backend/alerts.py, maintenance.py, scheduler)</w:t>
+      </w:r>
+    </w:p>
+    <w:p>
+      <w:pPr>
+        <w:pStyle w:val="ListBullet"/>
+      </w:pPr>
+      <w:r>
+        <w:rPr>
+          <w:color w:val="242422"/>
+        </w:rPr>
+        <w:t>Synchronisation Google Sheets (backend/sheets_sync.py)</w:t>
       </w:r>
     </w:p>
     <w:p>
@@ -816,6 +827,37 @@
               <w:rPr>
                 <w:sz w:val="19"/>
               </w:rPr>
+              <w:t>backend/sheets_sync.py</w:t>
+            </w:r>
+          </w:p>
+        </w:tc>
+        <w:tc>
+          <w:tcPr>
+            <w:tcW w:type="dxa" w:w="4706"/>
+            <w:shd w:fill="FAFAF8"/>
+          </w:tcPr>
+          <w:p>
+            <w:r/>
+            <w:r>
+              <w:rPr>
+                <w:sz w:val="19"/>
+              </w:rPr>
+              <w:t>Synchronisation Google Sheets -&gt; MySQL (table opportunities uniquement).</w:t>
+            </w:r>
+          </w:p>
+        </w:tc>
+      </w:tr>
+      <w:tr>
+        <w:tc>
+          <w:tcPr>
+            <w:tcW w:type="dxa" w:w="4706"/>
+          </w:tcPr>
+          <w:p>
+            <w:r/>
+            <w:r>
+              <w:rPr>
+                <w:sz w:val="19"/>
+              </w:rPr>
               <w:t>backend/db.py</w:t>
             </w:r>
           </w:p>
@@ -823,7 +865,6 @@
         <w:tc>
           <w:tcPr>
             <w:tcW w:type="dxa" w:w="4706"/>
-            <w:shd w:fill="FAFAF8"/>
           </w:tcPr>
           <w:p>
             <w:r/>
@@ -840,6 +881,7 @@
         <w:tc>
           <w:tcPr>
             <w:tcW w:type="dxa" w:w="4706"/>
+            <w:shd w:fill="FAFAF8"/>
           </w:tcPr>
           <w:p>
             <w:r/>
@@ -854,6 +896,7 @@
         <w:tc>
           <w:tcPr>
             <w:tcW w:type="dxa" w:w="4706"/>
+            <w:shd w:fill="FAFAF8"/>
           </w:tcPr>
           <w:p>
             <w:r/>
@@ -870,7 +913,6 @@
         <w:tc>
           <w:tcPr>
             <w:tcW w:type="dxa" w:w="4706"/>
-            <w:shd w:fill="FAFAF8"/>
           </w:tcPr>
           <w:p>
             <w:r/>
@@ -885,7 +927,6 @@
         <w:tc>
           <w:tcPr>
             <w:tcW w:type="dxa" w:w="4706"/>
-            <w:shd w:fill="FAFAF8"/>
           </w:tcPr>
           <w:p>
             <w:r/>
@@ -893,7 +934,7 @@
               <w:rPr>
                 <w:sz w:val="19"/>
               </w:rPr>
-              <w:t>Suite pytest — 100 tests, aucune dépendance réseau/DB réelle.</w:t>
+              <w:t>Suite pytest — 140 tests, aucune dépendance réseau/DB réelle.</w:t>
             </w:r>
           </w:p>
         </w:tc>
@@ -902,6 +943,7 @@
         <w:tc>
           <w:tcPr>
             <w:tcW w:type="dxa" w:w="4706"/>
+            <w:shd w:fill="FAFAF8"/>
           </w:tcPr>
           <w:p>
             <w:r/>
@@ -916,6 +958,7 @@
         <w:tc>
           <w:tcPr>
             <w:tcW w:type="dxa" w:w="4706"/>
+            <w:shd w:fill="FAFAF8"/>
           </w:tcPr>
           <w:p>
             <w:r/>
@@ -932,7 +975,6 @@
         <w:tc>
           <w:tcPr>
             <w:tcW w:type="dxa" w:w="4706"/>
-            <w:shd w:fill="FAFAF8"/>
           </w:tcPr>
           <w:p>
             <w:r/>
@@ -947,7 +989,6 @@
         <w:tc>
           <w:tcPr>
             <w:tcW w:type="dxa" w:w="4706"/>
-            <w:shd w:fill="FAFAF8"/>
           </w:tcPr>
           <w:p>
             <w:r/>
@@ -964,6 +1005,7 @@
         <w:tc>
           <w:tcPr>
             <w:tcW w:type="dxa" w:w="4706"/>
+            <w:shd w:fill="FAFAF8"/>
           </w:tcPr>
           <w:p>
             <w:r/>
@@ -978,6 +1020,7 @@
         <w:tc>
           <w:tcPr>
             <w:tcW w:type="dxa" w:w="4706"/>
+            <w:shd w:fill="FAFAF8"/>
           </w:tcPr>
           <w:p>
             <w:r/>
@@ -3089,7 +3132,7 @@
           <w:b w:val="0"/>
           <w:i w:val="0"/>
         </w:rPr>
-        <w:t>Le troisième niveau est le plus important pédagogiquement : une instruction de prompt n'est jamais une garantie (le LLM l'a déjà ignorée une fois pour le scatter, voir section 14), donc la correction réellement fiable est celle qui ne dépend pas du LLM pour se déclencher. Le tableau affiche aussi désormais « Échéance dépassée depuis N jours » plutôt qu'un nombre négatif brut, pour les cas où une deadline passée reste légitimement visible (ex: une liste non filtrée par date).</w:t>
+        <w:t>Le troisième niveau est le plus important pédagogiquement : une instruction de prompt n'est jamais une garantie (le LLM l'a déjà ignorée une fois pour le scatter, voir section 15), donc la correction réellement fiable est celle qui ne dépend pas du LLM pour se déclencher. Le tableau affiche aussi désormais « Échéance dépassée depuis N jours » plutôt qu'un nombre négatif brut, pour les cas où une deadline passée reste légitimement visible (ex: une liste non filtrée par date).</w:t>
       </w:r>
     </w:p>
     <w:p>
@@ -3161,7 +3204,217 @@
           <w:color w:val="F2405A"/>
           <w:sz w:val="36"/>
         </w:rPr>
-        <w:t>11. Frontend (Vite + React)</w:t>
+        <w:t>11. Synchronisation Google Sheets -&gt; MySQL</w:t>
+      </w:r>
+    </w:p>
+    <w:p>
+      <w:r>
+        <w:rPr>
+          <w:b w:val="0"/>
+          <w:i w:val="0"/>
+        </w:rPr>
+        <w:t>backend/sheets_sync.py. Le Sheet devient un formulaire d'ajout/modification d'opportunités, plus simple à éditer au quotidien qu'une base de données directement — l'application continue de LIRE depuis MySQL comme avant (chat, graphiques, alertes) ; ce module importe uniquement les changements du Sheet vers la base, jamais l'inverse.</w:t>
+      </w:r>
+    </w:p>
+    <w:p>
+      <w:pPr>
+        <w:keepNext/>
+        <w:spacing w:before="280" w:after="120"/>
+      </w:pPr>
+      <w:r>
+        <w:rPr>
+          <w:b/>
+          <w:color w:val="242422"/>
+          <w:sz w:val="27"/>
+        </w:rPr>
+        <w:t>11.1 Authentification par compte de service, pas une simple clé API</w:t>
+      </w:r>
+    </w:p>
+    <w:p>
+      <w:r>
+        <w:rPr>
+          <w:b w:val="0"/>
+          <w:i w:val="0"/>
+        </w:rPr>
+        <w:t>La synchro doit pouvoir ÉCRIRE dans le Sheet (réinjecter l'id MySQL généré pour chaque nouvelle ligne, condition de son idempotence — voir 11.3), ce qu'une clé API seule ne permet pas (lecture seule). Authentification par compte de service Google (fichier JSON, ajouté en Éditeur sur le Sheet cible) via gspread.service_account().</w:t>
+      </w:r>
+    </w:p>
+    <w:p>
+      <w:pPr>
+        <w:keepNext/>
+        <w:spacing w:before="280" w:after="120"/>
+      </w:pPr>
+      <w:r>
+        <w:rPr>
+          <w:b/>
+          <w:color w:val="242422"/>
+          <w:sz w:val="27"/>
+        </w:rPr>
+        <w:t>11.2 Champs toujours recalculés, jamais lus depuis le Sheet</w:t>
+      </w:r>
+    </w:p>
+    <w:p>
+      <w:r>
+        <w:rPr>
+          <w:b w:val="0"/>
+          <w:i w:val="0"/>
+        </w:rPr>
+        <w:t>deadline_month, deadline_year, days_remaining et weighted_amount sont toujours dérivés des colonnes brutes (deadline, financial_offer, win_probability) au moment de la synchro, même s'ils figurent en colonne dans le Sheet — même principe que days_remaining ailleurs dans le projet (section 10.1) : une donnée calculable ne doit jamais dépendre d'une saisie externe qui pourrait diverger.</w:t>
+      </w:r>
+    </w:p>
+    <w:p>
+      <w:pPr>
+        <w:keepNext/>
+        <w:spacing w:before="280" w:after="120"/>
+      </w:pPr>
+      <w:r>
+        <w:rPr>
+          <w:b/>
+          <w:color w:val="242422"/>
+          <w:sz w:val="27"/>
+        </w:rPr>
+        <w:t>11.3 Idempotence de l'insertion — réécriture de l'id dans le Sheet</w:t>
+      </w:r>
+    </w:p>
+    <w:p>
+      <w:r>
+        <w:rPr>
+          <w:b w:val="0"/>
+          <w:i w:val="0"/>
+        </w:rPr>
+        <w:t>Une ligne sans id = nouvelle opportunité. Après l'INSERT MySQL, l'id généré (cur.lastrowid) est immédiatement réécrit dans la cellule id du Sheet — sans quoi la synchro suivante (15 minutes plus tard) réinsérerait la même ligne en double, faute de moyen de la reconnaître comme déjà traitée. Si cette réécriture échoue (ligne insérée mais Sheet non mis à jour), l'erreur est journalisée bruyamment plutôt que silencieusement absorbée — l'insertion MySQL, elle, reste acquise.</w:t>
+      </w:r>
+    </w:p>
+    <w:p>
+      <w:pPr>
+        <w:keepNext/>
+        <w:spacing w:before="280" w:after="120"/>
+      </w:pPr>
+      <w:r>
+        <w:rPr>
+          <w:b/>
+          <w:color w:val="242422"/>
+          <w:sz w:val="27"/>
+        </w:rPr>
+        <w:t>11.4 Validation par ligne, jamais bloquante</w:t>
+      </w:r>
+    </w:p>
+    <w:p>
+      <w:r>
+        <w:rPr>
+          <w:b w:val="0"/>
+          <w:i w:val="0"/>
+        </w:rPr>
+        <w:t>Chaque ligne est validée indépendamment (dates aux deux formats acceptés, nombres avec virgule décimale, probabilité en fraction ou en pourcentage, practice/opp_type/status contre la liste blanche déjà utilisée par le chat) — une ligne invalide est journalisée et sautée, sans jamais empêcher l'import des autres. Les littéraux "NULL"/"N/A" laissés par l'export CSV -&gt; Sheets sont normalisés en valeur vide plutôt que stockés tels quels comme texte.</w:t>
+      </w:r>
+    </w:p>
+    <w:p>
+      <w:pPr>
+        <w:keepNext/>
+        <w:spacing w:before="280" w:after="120"/>
+      </w:pPr>
+      <w:r>
+        <w:rPr>
+          <w:b/>
+          <w:color w:val="242422"/>
+          <w:sz w:val="27"/>
+        </w:rPr>
+        <w:t>11.5 Bug trouvé en conditions réelles — cursor.rowcount ne veut pas dire ce qu'on croit</w:t>
+      </w:r>
+    </w:p>
+    <w:p>
+      <w:r>
+        <w:rPr>
+          <w:b w:val="0"/>
+          <w:i w:val="0"/>
+        </w:rPr>
+        <w:t>Premier test en direct (pas seulement avec des mocks) : la synchro rapportait 1 ligne mise à jour et 359 ignorées pour « id introuvable », alors que ces ids existaient bel et bien en base. Cause : la détection « id existant vs nouveau » se fiait à cursor.rowcount après un UPDATE — or PyMySQL (sans CLIENT_FOUND_ROWS) renvoie le nombre de lignes réellement MODIFIÉES, pas trouvées. Le Sheet étant un export frais de la base, la quasi-totalité des UPDATE ne changeaient aucune valeur, donc rowcount valait 0 même sur un id existant. Corrigé en préchargeant une fois l'ensemble des ids existants (SELECT id FROM opportunities) plutôt que de déduire l'existence du résultat de l'UPDATE. Vérifié après correction : 348 lignes mises à jour, 12 sautées à raison — révélant un vrai problème de qualité de données préexistant (des valeurs opp_type comme "DP"/"AMI" saisies par erreur dans la colonne status).</w:t>
+      </w:r>
+    </w:p>
+    <w:p>
+      <w:pPr>
+        <w:keepNext/>
+        <w:spacing w:before="280" w:after="120"/>
+      </w:pPr>
+      <w:r>
+        <w:rPr>
+          <w:b/>
+          <w:color w:val="242422"/>
+          <w:sz w:val="27"/>
+        </w:rPr>
+        <w:t>11.6 Décision volontaire : pas de suppression automatique</w:t>
+      </w:r>
+    </w:p>
+    <w:p>
+      <w:r>
+        <w:rPr>
+          <w:b w:val="0"/>
+          <w:i w:val="0"/>
+        </w:rPr>
+        <w:t>Retirer une ligne du Sheet ne supprime jamais l'opportunité correspondante en base. Une synchro automatique et non surveillée, qui tourne indéfiniment toutes les 15 minutes, est le mauvais endroit pour une opération destructive et irréversible : une lecture partielle, un mauvais onglet ou un Sheet vidé par erreur pourrait effacer de vraies données sans que personne ne le voie venir avant le prochain passage. Ajout et modification seulement — un choix de prudence assumé plutôt qu'un oubli.</w:t>
+      </w:r>
+    </w:p>
+    <w:p>
+      <w:pPr>
+        <w:keepNext/>
+        <w:spacing w:before="280" w:after="120"/>
+      </w:pPr>
+      <w:r>
+        <w:rPr>
+          <w:b/>
+          <w:color w:val="242422"/>
+          <w:sz w:val="27"/>
+        </w:rPr>
+        <w:t>11.7 Optimisation — mettre en cache la résolution du Sheet, pas seulement le client</w:t>
+      </w:r>
+    </w:p>
+    <w:p>
+      <w:r>
+        <w:rPr>
+          <w:b w:val="0"/>
+          <w:i w:val="0"/>
+        </w:rPr>
+        <w:t>Profilage demandé après coup, pour vérifier l'absence de régression de performance : le coût réel n'était pas les écritures MySQL (360 UPDATE séquentiels mesurés à 0.032s au total) mais open_by_key() + worksheet(), deux allers-retours réseau vers l'API Google Sheets (1.6s mesurés à eux deux) — rejoués à chaque appel de sync_sheet_to_mysql() alors que le client gspread authentifié, lui, était déjà mis en cache. Corrigé en mettant aussi en cache l'objet Worksheet résolu : un appel répété passe de 1.6s à 0s, et une synchro complète de ~1.1s à ~0.4s une fois le cache chaud — un gain qui se répète indéfiniment, toutes les 15 minutes. Les trois tâches de démarrage (recalcul days_remaining, vérification d'alerte, synchro Sheets) bloquaient aussi le démarrage du serveur (exécutées avant que FastAPI n'accepte une seule requête HTTP, dans lifespan()) ; elles tournent désormais comme jobs « une fois immédiatement » sur le thread du scheduler, sans retarder la disponibilité du serveur.</w:t>
+      </w:r>
+    </w:p>
+    <w:p>
+      <w:pPr>
+        <w:keepNext/>
+        <w:spacing w:before="280" w:after="120"/>
+      </w:pPr>
+      <w:r>
+        <w:rPr>
+          <w:b/>
+          <w:color w:val="242422"/>
+          <w:sz w:val="27"/>
+        </w:rPr>
+        <w:t>11.8 Déclenchement</w:t>
+      </w:r>
+    </w:p>
+    <w:p>
+      <w:r>
+        <w:rPr>
+          <w:b w:val="0"/>
+          <w:i w:val="0"/>
+        </w:rPr>
+        <w:t>Trois déclencheurs : toutes les 15 minutes (APScheduler, job sheets_sync_periodic), une fois au démarrage du serveur, et à la demande via POST /sheets/sync — utile pour forcer un import sans attendre le prochain cycle.</w:t>
+      </w:r>
+    </w:p>
+    <w:p>
+      <w:pPr>
+        <w:keepNext/>
+        <w:spacing w:before="400" w:after="200"/>
+        <w:pBdr>
+          <w:bottom w:val="single" w:sz="18" w:space="4" w:color="D42A45"/>
+        </w:pBdr>
+      </w:pPr>
+      <w:r>
+        <w:rPr>
+          <w:b/>
+          <w:color w:val="F2405A"/>
+          <w:sz w:val="36"/>
+        </w:rPr>
+        <w:t>12. Frontend (Vite + React)</w:t>
       </w:r>
     </w:p>
     <w:p>
@@ -3215,7 +3468,7 @@
           <w:color w:val="242422"/>
           <w:sz w:val="27"/>
         </w:rPr>
-        <w:t>11.1 Historique de conversation persistant (useChatHistory.js)</w:t>
+        <w:t>12.1 Historique de conversation persistant (useChatHistory.js)</w:t>
       </w:r>
     </w:p>
     <w:p>
@@ -3238,7 +3491,7 @@
           <w:color w:val="242422"/>
           <w:sz w:val="27"/>
         </w:rPr>
-        <w:t>11.2 Bug trouvé : header illisible en mode sombre</w:t>
+        <w:t>12.2 Bug trouvé : header illisible en mode sombre</w:t>
       </w:r>
     </w:p>
     <w:p>
@@ -3273,7 +3526,7 @@
           <w:color w:val="F2405A"/>
           <w:sz w:val="36"/>
         </w:rPr>
-        <w:t>12. Sécurité</w:t>
+        <w:t>13. Sécurité</w:t>
       </w:r>
     </w:p>
     <w:p>
@@ -3302,6 +3555,14 @@
     </w:p>
     <w:p>
       <w:pPr>
+        <w:pStyle w:val="ListBullet"/>
+      </w:pPr>
+      <w:r>
+        <w:t>credentials/ (clé de compte de service Google, section 11.1) est gitignoré au niveau du dossier entier — jamais de fichier JSON de credentials commité, quel que soit son nom.</w:t>
+      </w:r>
+    </w:p>
+    <w:p>
+      <w:pPr>
         <w:keepNext/>
         <w:spacing w:before="400" w:after="200"/>
         <w:pBdr>
@@ -3314,7 +3575,7 @@
           <w:color w:val="F2405A"/>
           <w:sz w:val="36"/>
         </w:rPr>
-        <w:t>13. Tests automatisés</w:t>
+        <w:t>14. Tests automatisés</w:t>
       </w:r>
     </w:p>
     <w:p>
@@ -3323,7 +3584,7 @@
           <w:b w:val="0"/>
           <w:i w:val="0"/>
         </w:rPr>
-        <w:t>100 tests pytest, sans dépendance réseau ni base de données réelle : le client Groq et les connexions MySQL sont simulés (monkeypatch) via de faux objets (fake cursor/connection capturant la requête générée pour l'affirmer dans le test). Complétés systématiquement par une vérification en conditions réelles (DB MySQL réelle, appel Groq réel, et compilation par le vrai moteur vega-lite en Node.js) — les tests protègent contre les régressions, la vérification réelle est ce qui a révélé les deux bugs texte/graphique de la section 8.3.</w:t>
+        <w:t>140 tests pytest, sans dépendance réseau ni base de données réelle : le client Groq, les connexions MySQL et le client Google Sheets (gspread) sont simulés (monkeypatch) via de faux objets (fake cursor/connection capturant la requête générée pour l'affirmer dans le test). Complétés systématiquement par une vérification en conditions réelles (DB MySQL réelle, appel Groq réel, et compilation par le vrai moteur vega-lite en Node.js) — les tests protègent contre les régressions, la vérification réelle est ce qui a révélé les deux bugs texte/graphique de la section 8.3.</w:t>
       </w:r>
     </w:p>
     <w:tbl>
@@ -3708,6 +3969,53 @@
           </w:p>
         </w:tc>
       </w:tr>
+      <w:tr>
+        <w:tc>
+          <w:tcPr>
+            <w:tcW w:type="dxa" w:w="3137"/>
+            <w:shd w:fill="FAFAF8"/>
+          </w:tcPr>
+          <w:p>
+            <w:r/>
+            <w:r>
+              <w:rPr>
+                <w:sz w:val="19"/>
+              </w:rPr>
+              <w:t>test_sheets_sync.py</w:t>
+            </w:r>
+          </w:p>
+        </w:tc>
+        <w:tc>
+          <w:tcPr>
+            <w:tcW w:type="dxa" w:w="3137"/>
+            <w:shd w:fill="FAFAF8"/>
+          </w:tcPr>
+          <w:p>
+            <w:r/>
+            <w:r>
+              <w:rPr>
+                <w:sz w:val="19"/>
+              </w:rPr>
+              <w:t>30</w:t>
+            </w:r>
+          </w:p>
+        </w:tc>
+        <w:tc>
+          <w:tcPr>
+            <w:tcW w:type="dxa" w:w="3137"/>
+            <w:shd w:fill="FAFAF8"/>
+          </w:tcPr>
+          <w:p>
+            <w:r/>
+            <w:r>
+              <w:rPr>
+                <w:sz w:val="19"/>
+              </w:rPr>
+              <w:t>Parsing/validation par ligne, littéraux NULL, insertion + réécriture d'id, détection id existant/inconnu, ligne invalide sautée sans bloquer les autres, résilience à une panne de lecture du Sheet.</w:t>
+            </w:r>
+          </w:p>
+        </w:tc>
+      </w:tr>
     </w:tbl>
     <w:p/>
     <w:p>
@@ -3724,7 +4032,7 @@
           <w:color w:val="F2405A"/>
           <w:sz w:val="36"/>
         </w:rPr>
-        <w:t>14. Questions d'entretien probables</w:t>
+        <w:t>15. Questions d'entretien probables</w:t>
       </w:r>
     </w:p>
     <w:p>
@@ -3983,6 +4291,52 @@
     <w:p>
       <w:pPr>
         <w:keepNext/>
+        <w:spacing w:before="200" w:after="80"/>
+      </w:pPr>
+      <w:r>
+        <w:rPr>
+          <w:b/>
+          <w:color w:val="D42A45"/>
+          <w:sz w:val="23"/>
+        </w:rPr>
+        <w:t>Q : Pourquoi ne pas synchroniser aussi les suppressions (Sheet -&gt; base) ?</w:t>
+      </w:r>
+    </w:p>
+    <w:p>
+      <w:r>
+        <w:rPr>
+          <w:b w:val="0"/>
+          <w:i w:val="0"/>
+        </w:rPr>
+        <w:t>Choix de prudence délibéré, pas un oubli : la synchro tourne toutes les 15 minutes sans supervision humaine. Une suppression automatique y est le pire endroit possible pour une opération destructive et irréversible — une lecture partielle, un mauvais onglet ou un Sheet vidé par erreur effacerait de vraies données avant que quiconque ne le remarque. Le risque a été explicitement évalué avec le porteur du projet, qui a choisi de garantir seulement l'ajout et la modification plutôt que la fonctionnalité complète.</w:t>
+      </w:r>
+    </w:p>
+    <w:p>
+      <w:pPr>
+        <w:keepNext/>
+        <w:spacing w:before="200" w:after="80"/>
+      </w:pPr>
+      <w:r>
+        <w:rPr>
+          <w:b/>
+          <w:color w:val="D42A45"/>
+          <w:sz w:val="23"/>
+        </w:rPr>
+        <w:t>Q : Un test avec des mocks peut-il garantir qu'une intégration externe (Google Sheets, MySQL) fonctionne réellement ?</w:t>
+      </w:r>
+    </w:p>
+    <w:p>
+      <w:r>
+        <w:rPr>
+          <w:b w:val="0"/>
+          <w:i w:val="0"/>
+        </w:rPr>
+        <w:t>Non — exemple concret rencontré sur ce projet : tous les tests mockés de la synchro Sheets passaient, mais le premier essai en conditions réelles rapportait 359 lignes sur 360 comme « id introuvable » alors qu'elles existaient toutes en base. La cause (cursor.rowcount qui compte les lignes modifiées, pas trouvées) n'était visible qu'avec de vraies données où la plupart des UPDATE ne changent rien. Les mocks avaient simulé le comportement qu'on attendait de rowcount, pas son vrai comportement — la leçon : les mocks valident la logique connue, seule une vérification en conditions réelles révèle ce qu'on n'avait pas anticipé.</w:t>
+      </w:r>
+    </w:p>
+    <w:p>
+      <w:pPr>
+        <w:keepNext/>
         <w:spacing w:before="400" w:after="200"/>
         <w:pBdr>
           <w:bottom w:val="single" w:sz="18" w:space="4" w:color="D42A45"/>
@@ -3994,7 +4348,7 @@
           <w:color w:val="F2405A"/>
           <w:sz w:val="36"/>
         </w:rPr>
-        <w:t>15. Limites connues</w:t>
+        <w:t>16. Limites connues</w:t>
       </w:r>
     </w:p>
     <w:p>
@@ -4019,6 +4373,22 @@
       </w:pPr>
       <w:r>
         <w:t>Le nuage de points et la carte de chaleur n'ont pas de garde-fou de cardinalité aussi mûr que bar/pie pour des cas extrêmes (dimension à très forte cardinalité en axe du heatmap au-delà du plafond testé).</w:t>
+      </w:r>
+    </w:p>
+    <w:p>
+      <w:pPr>
+        <w:pStyle w:val="ListBullet"/>
+      </w:pPr>
+      <w:r>
+        <w:t>La synchro Google Sheets ne détecte pas les suppressions (section 11.6, choix délibéré) et retraite chaque ligne à chaque passage plutôt que de ne toucher que les lignes changées — sans impact réel à l'échelle actuelle (360 lignes/15 min), mais à reconsidérer si le Sheet grossissait beaucoup.</w:t>
+      </w:r>
+    </w:p>
+    <w:p>
+      <w:pPr>
+        <w:pStyle w:val="ListBullet"/>
+      </w:pPr>
+      <w:r>
+        <w:t>12 opportunités en base ont un status invalide, présent avant même la synchro Sheets et jamais détecté faute de validation stricte à l'écriture d'origine (section 11.5) — à corriger manuellement ou à ajouter à la liste blanche si ce sont des statuts légitimes.</w:t>
       </w:r>
     </w:p>
     <w:sectPr>

</xml_diff>

<commit_message>
Log the finishing pass and refresh the reports
PROGRESS.md gains its Phase 22 entry, covering the accuracy audit (the
6.58 M EUR lost to a bare LIMIT, the funnel that was never a funnel and
its 800% conversion rates, the weighted-amount KPI covering half the
portfolio), then the relevance, context, data-quality, reliability and
branding work.

The generated reports carried two statements that the finishing pass
made false: that the dashboard area could not wear the Devoteam theme,
and that the unused Vega module still sat in the repository. Both are
corrected, and the repo structure now lists business_rules.py and
data_quality.py in its place.

Test counts updated to 158 across README and both documents.

Co-Authored-By: Claude Sonnet 5 <noreply@anthropic.com>
</commit_message>
<xml_diff>
--- a/Documentation/reports/Guide_Technique_DevoTeam_Dashboard.docx
+++ b/Documentation/reports/Guide_Technique_DevoTeam_Dashboard.docx
@@ -1006,7 +1006,7 @@
               <w:rPr>
                 <w:sz w:val="19"/>
               </w:rPr>
-              <w:t>backend/vega_generator.py</w:t>
+              <w:t>backend/business_rules.py</w:t>
             </w:r>
           </w:p>
         </w:tc>
@@ -1021,7 +1021,7 @@
               <w:rPr>
                 <w:sz w:val="19"/>
               </w:rPr>
-              <w:t>Héritage Vega-Lite — plus utilisé par l'interface (voir section 16).</w:t>
+              <w:t>Règles métier indépendantes de l'affichage (ordre du pipeline).</w:t>
             </w:r>
           </w:p>
         </w:tc>
@@ -1037,6 +1037,37 @@
               <w:rPr>
                 <w:sz w:val="19"/>
               </w:rPr>
+              <w:t>backend/data_quality.py</w:t>
+            </w:r>
+          </w:p>
+        </w:tc>
+        <w:tc>
+          <w:tcPr>
+            <w:tcW w:type="dxa" w:w="4706"/>
+          </w:tcPr>
+          <w:p>
+            <w:r/>
+            <w:r>
+              <w:rPr>
+                <w:sz w:val="19"/>
+              </w:rPr>
+              <w:t>Rapport des lignes rejetées et des valeurs manquantes.</w:t>
+            </w:r>
+          </w:p>
+        </w:tc>
+      </w:tr>
+      <w:tr>
+        <w:tc>
+          <w:tcPr>
+            <w:tcW w:type="dxa" w:w="4706"/>
+            <w:shd w:fill="FAFAF8"/>
+          </w:tcPr>
+          <w:p>
+            <w:r/>
+            <w:r>
+              <w:rPr>
+                <w:sz w:val="19"/>
+              </w:rPr>
               <w:t>dac/.bruin.yml</w:t>
             </w:r>
           </w:p>
@@ -1044,6 +1075,7 @@
         <w:tc>
           <w:tcPr>
             <w:tcW w:type="dxa" w:w="4706"/>
+            <w:shd w:fill="FAFAF8"/>
           </w:tcPr>
           <w:p>
             <w:r/>
@@ -1060,7 +1092,6 @@
         <w:tc>
           <w:tcPr>
             <w:tcW w:type="dxa" w:w="4706"/>
-            <w:shd w:fill="FAFAF8"/>
           </w:tcPr>
           <w:p>
             <w:r/>
@@ -1075,7 +1106,6 @@
         <w:tc>
           <w:tcPr>
             <w:tcW w:type="dxa" w:w="4706"/>
-            <w:shd w:fill="FAFAF8"/>
           </w:tcPr>
           <w:p>
             <w:r/>
@@ -1092,6 +1122,7 @@
         <w:tc>
           <w:tcPr>
             <w:tcW w:type="dxa" w:w="4706"/>
+            <w:shd w:fill="FAFAF8"/>
           </w:tcPr>
           <w:p>
             <w:r/>
@@ -1106,6 +1137,7 @@
         <w:tc>
           <w:tcPr>
             <w:tcW w:type="dxa" w:w="4706"/>
+            <w:shd w:fill="FAFAF8"/>
           </w:tcPr>
           <w:p>
             <w:r/>
@@ -1122,7 +1154,6 @@
         <w:tc>
           <w:tcPr>
             <w:tcW w:type="dxa" w:w="4706"/>
-            <w:shd w:fill="FAFAF8"/>
           </w:tcPr>
           <w:p>
             <w:r/>
@@ -1137,7 +1168,6 @@
         <w:tc>
           <w:tcPr>
             <w:tcW w:type="dxa" w:w="4706"/>
-            <w:shd w:fill="FAFAF8"/>
           </w:tcPr>
           <w:p>
             <w:r/>
@@ -1154,6 +1184,7 @@
         <w:tc>
           <w:tcPr>
             <w:tcW w:type="dxa" w:w="4706"/>
+            <w:shd w:fill="FAFAF8"/>
           </w:tcPr>
           <w:p>
             <w:r/>
@@ -1168,6 +1199,7 @@
         <w:tc>
           <w:tcPr>
             <w:tcW w:type="dxa" w:w="4706"/>
+            <w:shd w:fill="FAFAF8"/>
           </w:tcPr>
           <w:p>
             <w:r/>
@@ -1184,7 +1216,6 @@
         <w:tc>
           <w:tcPr>
             <w:tcW w:type="dxa" w:w="4706"/>
-            <w:shd w:fill="FAFAF8"/>
           </w:tcPr>
           <w:p>
             <w:r/>
@@ -1199,7 +1230,6 @@
         <w:tc>
           <w:tcPr>
             <w:tcW w:type="dxa" w:w="4706"/>
-            <w:shd w:fill="FAFAF8"/>
           </w:tcPr>
           <w:p>
             <w:r/>
@@ -1216,6 +1246,7 @@
         <w:tc>
           <w:tcPr>
             <w:tcW w:type="dxa" w:w="4706"/>
+            <w:shd w:fill="FAFAF8"/>
           </w:tcPr>
           <w:p>
             <w:r/>
@@ -1230,6 +1261,7 @@
         <w:tc>
           <w:tcPr>
             <w:tcW w:type="dxa" w:w="4706"/>
+            <w:shd w:fill="FAFAF8"/>
           </w:tcPr>
           <w:p>
             <w:r/>
@@ -1246,7 +1278,6 @@
         <w:tc>
           <w:tcPr>
             <w:tcW w:type="dxa" w:w="4706"/>
-            <w:shd w:fill="FAFAF8"/>
           </w:tcPr>
           <w:p>
             <w:r/>
@@ -1261,7 +1292,6 @@
         <w:tc>
           <w:tcPr>
             <w:tcW w:type="dxa" w:w="4706"/>
-            <w:shd w:fill="FAFAF8"/>
           </w:tcPr>
           <w:p>
             <w:r/>
@@ -3531,7 +3561,7 @@
           <w:b w:val="0"/>
           <w:i w:val="0"/>
         </w:rPr>
-        <w:t>152 tests pytest, sans dépendance réseau ni données réelles : le client Gemini et le client Google Sheets (gspread) sont simulés (monkeypatch), et les données sont un petit DataFrame construit dans le test. La suite tourne donc hors ligne, en quelques secondes.</w:t>
+        <w:t>158 tests pytest, sans dépendance réseau ni données réelles : le client Gemini et le client Google Sheets (gspread) sont simulés (monkeypatch), et les données sont un petit DataFrame construit dans le test. La suite tourne donc hors ligne, en quelques secondes.</w:t>
       </w:r>
     </w:p>
     <w:p>
@@ -4405,15 +4435,7 @@
         <w:pStyle w:val="ListBullet"/>
       </w:pPr>
       <w:r>
-        <w:t>La zone tableau de bord utilise l'apparence de DAC, pas le thème Devoteam : DAC sert sa propre interface web, impossible à rendre comme un composant React, donc les jetons de couleur et le mode sombre du projet ne s'y appliquent pas. Le chat, lui, garde le branding complet.</w:t>
-      </w:r>
-    </w:p>
-    <w:p>
-      <w:pPr>
-        <w:pStyle w:val="ListBullet"/>
-      </w:pPr>
-      <w:r>
-        <w:t>Le module Vega-Lite n'est plus utilisé par l'interface depuis le passage à DAC, mais reste dans le dépôt (backend/vega_generator.py et le composant React associé) — un nettoyage dédié reste à faire, il allègerait aussi sensiblement le bundle frontend.</w:t>
+        <w:t>Le mode sombre ne s'applique pas à la zone tableau de bord. L'identité Devoteam, elle, y est appliquée par un thème dédié (couleurs et palette de graphiques reprises de l'application), mais ce thème est un paramètre du serveur de tableaux de bord, fixé à son lancement : il ne peut donc pas suivre le bouton clair/sombre du navigateur, qui ne concerne que le chat.</w:t>
       </w:r>
     </w:p>
     <w:p>

</xml_diff>